<commit_message>
Preserve September discovery reports and Biomni Azure work before CAA integration
</commit_message>
<xml_diff>
--- a/outputs/grant_revision_2026-09-06/R01_Subaims_1a_1b_Approach_With_Figure.docx
+++ b/outputs/grant_revision_2026-09-06/R01_Subaims_1a_1b_Approach_With_Figure.docx
@@ -15,7 +15,7 @@
       <w:r>
         <w:drawing>
           <wp:inline xmlns:a="http://schemas.openxmlformats.org/drawingml/2006/main" xmlns:pic="http://schemas.openxmlformats.org/drawingml/2006/picture">
-            <wp:extent cx="6858000" cy="6126480"/>
+            <wp:extent cx="6858000" cy="6583680"/>
             <wp:docPr id="1" name="Picture 1"/>
             <wp:cNvGraphicFramePr>
               <a:graphicFrameLocks noChangeAspect="1"/>
@@ -36,7 +36,7 @@
                   <pic:spPr>
                     <a:xfrm>
                       <a:off x="0" y="0"/>
-                      <a:ext cx="6858000" cy="6126480"/>
+                      <a:ext cx="6858000" cy="6583680"/>
                     </a:xfrm>
                     <a:prstGeom prst="rect"/>
                   </pic:spPr>

</xml_diff>